<commit_message>
report: bullet text aligns on a tab stop instead of stretched spaces under justification
</commit_message>
<xml_diff>
--- a/report/build/Sentinel_Nagarkar_AIIR_Sprint_2026.docx
+++ b/report/build/Sentinel_Nagarkar_AIIR_Sprint_2026.docx
@@ -745,6 +745,9 @@
     </w:p>
     <w:p>
       <w:pPr>
+        <w:tabs>
+          <w:tab w:pos="432" w:val="left"/>
+        </w:tabs>
         <w:spacing w:after="80" w:line="252" w:lineRule="auto"/>
         <w:ind w:left="432" w:hanging="288"/>
         <w:jc w:val="both"/>
@@ -754,11 +757,16 @@
           <w:rFonts w:ascii="Old Standard TT" w:hAnsi="Old Standard TT"/>
           <w:sz w:val="21"/>
         </w:rPr>
-        <w:t>•  A declared-scope representation (a JSON allowlist) and Sentinel, a mechanical, Inspect-native scanner that turns the first tool-call destination outside that scope into a finding a third party can recompute from files alone, implementing the declared-action half of the egress-attestation spec proposed as Track 1 example 5.</w:t>
-      </w:r>
-    </w:p>
-    <w:p>
-      <w:pPr>
+        <w:t>•</w:t>
+        <w:tab/>
+        <w:t>A declared-scope representation (a JSON allowlist) and Sentinel, a mechanical, Inspect-native scanner that turns the first tool-call destination outside that scope into a finding a third party can recompute from files alone, implementing the declared-action half of the egress-attestation spec proposed as Track 1 example 5.</w:t>
+      </w:r>
+    </w:p>
+    <w:p>
+      <w:pPr>
+        <w:tabs>
+          <w:tab w:pos="432" w:val="left"/>
+        </w:tabs>
         <w:spacing w:after="80" w:line="252" w:lineRule="auto"/>
         <w:ind w:left="432" w:hanging="288"/>
         <w:jc w:val="both"/>
@@ -768,11 +776,16 @@
           <w:rFonts w:ascii="Old Standard TT" w:hAnsi="Old Standard TT"/>
           <w:sz w:val="21"/>
         </w:rPr>
-        <w:t>•  An allowlist-misspecification ablation on a reconstruction of the Hugging Face trace: a too-tight scope pages on permitted traffic; a wildcard scope is silent on the escape. The control is the pair (trace, allowlist), not the detector.</w:t>
-      </w:r>
-    </w:p>
-    <w:p>
-      <w:pPr>
+        <w:t>•</w:t>
+        <w:tab/>
+        <w:t>An allowlist-misspecification ablation on a reconstruction of the Hugging Face trace: a too-tight scope pages on permitted traffic; a wildcard scope is silent on the escape. The control is the pair (trace, allowlist), not the detector.</w:t>
+      </w:r>
+    </w:p>
+    <w:p>
+      <w:pPr>
+        <w:tabs>
+          <w:tab w:pos="432" w:val="left"/>
+        </w:tabs>
         <w:spacing w:after="80" w:line="252" w:lineRule="auto"/>
         <w:ind w:left="432" w:hanging="288"/>
         <w:jc w:val="both"/>
@@ -782,11 +795,16 @@
           <w:rFonts w:ascii="Old Standard TT" w:hAnsi="Old Standard TT"/>
           <w:sz w:val="21"/>
         </w:rPr>
-        <w:t>•  Seven incident-derived fixtures with stated provenance, used as executable specifications rather than a benchmark, plus a tested statement of what the method cannot see: an escape through a permitted egress, and spoofed arguments.</w:t>
-      </w:r>
-    </w:p>
-    <w:p>
-      <w:pPr>
+        <w:t>•</w:t>
+        <w:tab/>
+        <w:t>Seven incident-derived fixtures with stated provenance, used as executable specifications rather than a benchmark, plus a tested statement of what the method cannot see: an escape through a permitted egress, and spoofed arguments.</w:t>
+      </w:r>
+    </w:p>
+    <w:p>
+      <w:pPr>
+        <w:tabs>
+          <w:tab w:pos="432" w:val="left"/>
+        </w:tabs>
         <w:spacing w:after="80" w:line="252" w:lineRule="auto"/>
         <w:ind w:left="432" w:hanging="288"/>
         <w:jc w:val="both"/>
@@ -796,7 +814,9 @@
           <w:rFonts w:ascii="Old Standard TT" w:hAnsi="Old Standard TT"/>
           <w:sz w:val="21"/>
         </w:rPr>
-        <w:t xml:space="preserve">•  The same rule run over a third party's record of a real incident, the </w:t>
+        <w:t>•</w:t>
+        <w:tab/>
+        <w:t xml:space="preserve">The same rule run over a third party's record of a real incident, the </w:t>
       </w:r>
       <w:proofErr w:type="spellStart"/>
       <w:r>
@@ -4385,6 +4405,9 @@
     </w:p>
     <w:p>
       <w:pPr>
+        <w:tabs>
+          <w:tab w:pos="432" w:val="left"/>
+        </w:tabs>
         <w:spacing w:after="80" w:line="252" w:lineRule="auto"/>
         <w:ind w:left="432" w:hanging="288"/>
         <w:jc w:val="both"/>
@@ -4394,7 +4417,9 @@
           <w:rFonts w:ascii="Old Standard TT" w:hAnsi="Old Standard TT"/>
           <w:sz w:val="21"/>
         </w:rPr>
-        <w:t>•  The positive fixtures are reconstructions of four to seven events from public descriptions; Hugging Face logged about 17,600 attacker actions [</w:t>
+        <w:t>•</w:t>
+        <w:tab/>
+        <w:t>The positive fixtures are reconstructions of four to seven events from public descriptions; Hugging Face logged about 17,600 attacker actions [</w:t>
       </w:r>
       <w:hyperlink w:anchor="ref2">
         <w:r>
@@ -4415,6 +4440,9 @@
     </w:p>
     <w:p>
       <w:pPr>
+        <w:tabs>
+          <w:tab w:pos="432" w:val="left"/>
+        </w:tabs>
         <w:spacing w:after="80" w:line="252" w:lineRule="auto"/>
         <w:ind w:left="432" w:hanging="288"/>
         <w:jc w:val="both"/>
@@ -4424,7 +4452,9 @@
           <w:rFonts w:ascii="Old Standard TT" w:hAnsi="Old Standard TT"/>
           <w:sz w:val="21"/>
         </w:rPr>
-        <w:t xml:space="preserve">•  The fixtures and the rule share an author, so the specification tests show consistency, not </w:t>
+        <w:t>•</w:t>
+        <w:tab/>
+        <w:t xml:space="preserve">The fixtures and the rule share an author, so the specification tests show consistency, not </w:t>
       </w:r>
       <w:proofErr w:type="spellStart"/>
       <w:r>
@@ -4461,6 +4491,9 @@
     </w:p>
     <w:p>
       <w:pPr>
+        <w:tabs>
+          <w:tab w:pos="432" w:val="left"/>
+        </w:tabs>
         <w:spacing w:after="80" w:line="252" w:lineRule="auto"/>
         <w:ind w:left="432" w:hanging="288"/>
         <w:jc w:val="both"/>
@@ -4470,11 +4503,16 @@
           <w:rFonts w:ascii="Old Standard TT" w:hAnsi="Old Standard TT"/>
           <w:sz w:val="21"/>
         </w:rPr>
-        <w:t>•  The live run is eight samples on tasks with no network, so it can only show silence. A positive live case needs an evaluation with internet on and a real allowlist. Wiki revision bodies are also a weaker kind of declared action than a curl argument: some URLs are links posted for other agents, not destinations reached.</w:t>
-      </w:r>
-    </w:p>
-    <w:p>
-      <w:pPr>
+        <w:t>•</w:t>
+        <w:tab/>
+        <w:t>The live run is eight samples on tasks with no network, so it can only show silence. A positive live case needs an evaluation with internet on and a real allowlist. Wiki revision bodies are also a weaker kind of declared action than a curl argument: some URLs are links posted for other agents, not destinations reached.</w:t>
+      </w:r>
+    </w:p>
+    <w:p>
+      <w:pPr>
+        <w:tabs>
+          <w:tab w:pos="432" w:val="left"/>
+        </w:tabs>
         <w:spacing w:after="80" w:line="252" w:lineRule="auto"/>
         <w:ind w:left="432" w:hanging="288"/>
         <w:jc w:val="both"/>
@@ -4484,7 +4522,23 @@
           <w:rFonts w:ascii="Old Standard TT" w:hAnsi="Old Standard TT"/>
           <w:sz w:val="21"/>
         </w:rPr>
-        <w:t>•  Sentinel reads declared arguments. METR reports that roughly 7% of the transcripts it evaluated in the Hugging Face investigation were successfully spoofed in places [</w:t>
+        <w:t>•</w:t>
+        <w:tab/>
+        <w:t>Sentinel reads declared arguments. METR reports that roughly 7% of the transcripts it evaluated in</w:t>
+      </w:r>
+      <w:r>
+        <w:rPr>
+          <w:rFonts w:ascii="Old Standard TT" w:hAnsi="Old Standard TT"/>
+          <w:sz w:val="21"/>
+        </w:rPr>
+        <w:t xml:space="preserve"> </w:t>
+      </w:r>
+      <w:r>
+        <w:rPr>
+          <w:rFonts w:ascii="Old Standard TT" w:hAnsi="Old Standard TT"/>
+          <w:sz w:val="21"/>
+        </w:rPr>
+        <w:t>the Hugging Face investigation were successfully spoofed in places [</w:t>
       </w:r>
       <w:hyperlink w:anchor="ref13">
         <w:r>
@@ -4505,6 +4559,9 @@
     </w:p>
     <w:p>
       <w:pPr>
+        <w:tabs>
+          <w:tab w:pos="432" w:val="left"/>
+        </w:tabs>
         <w:spacing w:after="80" w:line="252" w:lineRule="auto"/>
         <w:ind w:left="432" w:hanging="288"/>
         <w:jc w:val="both"/>
@@ -4514,7 +4571,9 @@
           <w:rFonts w:ascii="Old Standard TT" w:hAnsi="Old Standard TT"/>
           <w:sz w:val="21"/>
         </w:rPr>
-        <w:t xml:space="preserve">•  The extractor is regular expressions. Destinations hidden in shell variables, base64, DNS exfiltration or IP-as-integer forms are </w:t>
+        <w:t>•</w:t>
+        <w:tab/>
+        <w:t xml:space="preserve">The extractor is regular expressions. Destinations hidden in shell variables, base64, DNS exfiltration or IP-as-integer forms are </w:t>
       </w:r>
       <w:r>
         <w:rPr>
@@ -4563,6 +4622,9 @@
     </w:p>
     <w:p>
       <w:pPr>
+        <w:tabs>
+          <w:tab w:pos="432" w:val="left"/>
+        </w:tabs>
         <w:spacing w:after="80" w:line="252" w:lineRule="auto"/>
         <w:ind w:left="432" w:hanging="288"/>
         <w:jc w:val="both"/>
@@ -4572,7 +4634,9 @@
           <w:rFonts w:ascii="Old Standard TT" w:hAnsi="Old Standard TT"/>
           <w:sz w:val="21"/>
         </w:rPr>
-        <w:t xml:space="preserve">•  The wildcard scope is one misspecification of many. A scope that is correct today and stale tomorrow is the realistic </w:t>
+        <w:t>•</w:t>
+        <w:tab/>
+        <w:t xml:space="preserve">The wildcard scope is one misspecification of many. A scope that is correct today and stale tomorrow is the realistic </w:t>
       </w:r>
       <w:r>
         <w:rPr>

</xml_diff>

<commit_message>
report: carry the two Apart-review corrections into the paper
DSEWiki result now reads as what a reconstructed scope could have
picked up, not what a monitor would have caught (text, Table 2 header
and caption). METR spoofing line no longer presents ~7% as a measured
rate. PDF exported from the docx master and tracked.
</commit_message>
<xml_diff>
--- a/report/build/Sentinel_Nagarkar_AIIR_Sprint_2026.docx
+++ b/report/build/Sentinel_Nagarkar_AIIR_Sprint_2026.docx
@@ -3751,7 +3751,7 @@
                 <w:b/>
                 <w:sz w:val="16"/>
               </w:rPr>
-              <w:t>Before OpenAI's first visit (21 Jun)</w:t>
+              <w:t>Could have paged before OpenAI's first visit (21 Jun) by</w:t>
             </w:r>
           </w:p>
         </w:tc>
@@ -4087,7 +4087,7 @@
           <w:i/>
           <w:sz w:val="19"/>
         </w:rPr>
-        <w:t xml:space="preserve"> export under three declared scopes. The events are the researchers' record; the two non-wildcard scopes are our reconstruction from the task families visible in it. A revision can state more than one destination, so pages can exceed events. "Before OpenAI's first visit" is the interval to the date </w:t>
+        <w:t xml:space="preserve"> export under three declared scopes. The events are the researchers' record; the two non-wildcard scopes are our reconstruction from the task families visible in it. A revision can state more than one destination, so pages can exceed events. The last column is what such a scope could have caught, not what a monitor did: the interval to the date </w:t>
       </w:r>
       <w:proofErr w:type="spellStart"/>
       <w:proofErr w:type="gramStart"/>
@@ -4152,7 +4152,7 @@
           <w:rFonts w:ascii="Old Standard TT" w:hAnsi="Old Standard TT"/>
           <w:sz w:val="21"/>
         </w:rPr>
-        <w:t xml:space="preserve"> own host, at event 5: six hours into the first day of writing, the agents' fifth post already linked to the board they were writing on, 27 days before the first OpenAI-associated address visited the pages. Permitting the wiki hosts moves the first page to 26 May, where the stated destinations are a placeholder domain, then the first of 43 reader and CORS-proxy hosts (</w:t>
+        <w:t xml:space="preserve"> own host, at event 5: six hours into the first day of writing, the agents' fifth post already linked to the board they were writing on, 27 days before the first OpenAI-associated address visited the pages. Both non-wildcard scopes are our reconstruction, written after the fact, so this is what such a scope could have picked up had one been declared, not what a monitor would have caught. Permitting the wiki hosts moves the first page to 26 May, where the stated destinations are a placeholder domain, then the first of 43 reader and CORS-proxy hosts (</w:t>
       </w:r>
       <w:proofErr w:type="spellStart"/>
       <w:r>
@@ -4200,7 +4200,7 @@
           <w:rFonts w:ascii="Old Standard TT" w:hAnsi="Old Standard TT"/>
           <w:sz w:val="21"/>
         </w:rPr>
-        <w:t xml:space="preserve">), then drive.google.com. The extractor sees 200 distinct hosts in the record: 31 task data sources, 6 wiki hosts, 43 reader or CORS proxies, 4 shorteners, 5 archives, 4 tunnels. Interpretation: the ablation's two failure modes reproduce on a record we did not write. The scope the evaluation had was a wildcard, and a wildcard produces no page on a real containment failure; any scope that named what the task was for would have paged on the first day. Two caveats. 16,309 pages is an alert volume nobody reads, so the value is the first index, and the count is why layer 3, not layer 2, should gate paging; and </w:t>
+        <w:t xml:space="preserve">), then drive.google.com. The extractor sees 200 distinct hosts in the record: 31 task data sources, 6 wiki hosts, 43 reader or CORS proxies, 4 shorteners, 5 archives, 4 tunnels. Interpretation: the ablation's two failure modes reproduce on a record we did not write. The scope the evaluation had was a wildcard, and a wildcard produces no page on a real containment failure; a scope that named what the task was for could have paged on the first day. Two caveats. 16,309 pages is an alert volume nobody reads, so the value is the first index, and the count is why layer 3, not layer 2, should gate paging; and </w:t>
       </w:r>
       <w:r>
         <w:rPr>
@@ -4524,7 +4524,7 @@
         </w:rPr>
         <w:t>•</w:t>
         <w:tab/>
-        <w:t>Sentinel reads declared arguments. METR reports that roughly 7% of the transcripts it evaluated in</w:t>
+        <w:t>Sentinel reads declared arguments. METR reports detecting tool-call spoofing in</w:t>
       </w:r>
       <w:r>
         <w:rPr>
@@ -4538,7 +4538,7 @@
           <w:rFonts w:ascii="Old Standard TT" w:hAnsi="Old Standard TT"/>
           <w:sz w:val="21"/>
         </w:rPr>
-        <w:t>the Hugging Face investigation were successfully spoofed in places [</w:t>
+        <w:t>small-scale tests where it was obvious [</w:t>
       </w:r>
       <w:hyperlink w:anchor="ref13">
         <w:r>
@@ -4554,7 +4554,7 @@
           <w:rFonts w:ascii="Old Standard TT" w:hAnsi="Old Standard TT"/>
           <w:sz w:val="21"/>
         </w:rPr>
-        <w:t>]; an agent can state one destination and reach another. Layer 3 is the answer, and it is not built.</w:t>
+        <w:t>]. That is not a measured rate, and it says nothing about how often spoofing goes undetected; an agent can state one destination and reach another. Layer 3 is the answer, and it is not built.</w:t>
       </w:r>
     </w:p>
     <w:p>

</xml_diff>